<commit_message>
Align VAERS evaluation metrics to FAERS 1-to-1 standard and update tables, Figure 6, and manuscript
</commit_message>
<xml_diff>
--- a/publication/manuscripts/LLM4AE_rev1_clean_updated2.docx
+++ b/publication/manuscripts/LLM4AE_rev1_clean_updated2.docx
@@ -6718,7 +6718,7 @@
     </w:p>
     <w:p>
       <w:r>
-        <w:t>To evaluate cross-domain generalization beyond the FAERS dataset, we further analyzed the public VAERS corpus (N = 1,000 narratives). As reported in Table 4, BioBERT fine-tuned via 10-fold cross-validation achieved a strict exact-match F1 of 0.6594 ± 0.0196 (0.7848 ± 0.0127 Adapted ADE-Eval F1). In contrast, the 1-shot LLaMA 4 baseline evaluated under the official 11-category annotation guidance achieved a strict F1 of 0.2797 and an adapted ADE-Eval F1 of 0.5113 (with 0.6714 Precision and 0.4129 Recall).</w:t>
+        <w:t>To evaluate cross-domain generalization beyond the FAERS dataset, we further analyzed the public VAERS corpus (N = 1,000 narratives). As reported in Table 4, BioBERT fine-tuned via 10-fold cross-validation achieved a strict exact-match F1 of 0.7015 ± 0.0174 (0.8370 ± 0.0095 Adapted ADE-Eval F1). In contrast, the 1-shot LLaMA 4 baseline evaluated under the official 11-category annotation guidance achieved a strict F1 of 0.3383 and an adapted ADE-Eval F1 of 0.6400 (with 0.6691 Precision and 0.6134 Recall).</w:t>
       </w:r>
     </w:p>
     <w:p/>
@@ -6896,7 +6896,7 @@
                 <w:color w:val="222222"/>
                 <w:sz w:val="16"/>
               </w:rPr>
-              <w:t>0.6594 ± 0.0196</w:t>
+              <w:t>0.7015 ± 0.0174</w:t>
             </w:r>
           </w:p>
         </w:tc>
@@ -6925,7 +6925,7 @@
                 <w:color w:val="222222"/>
                 <w:sz w:val="16"/>
               </w:rPr>
-              <w:t>0.7848 ± 0.0127</w:t>
+              <w:t>0.8370 ± 0.0095</w:t>
             </w:r>
           </w:p>
         </w:tc>
@@ -6985,7 +6985,7 @@
                 <w:color w:val="222222"/>
                 <w:sz w:val="16"/>
               </w:rPr>
-              <w:t>0.2797</w:t>
+              <w:t>0.3383</w:t>
             </w:r>
           </w:p>
         </w:tc>
@@ -7014,7 +7014,7 @@
                 <w:color w:val="222222"/>
                 <w:sz w:val="16"/>
               </w:rPr>
-              <w:t>0.5113</w:t>
+              <w:t>0.6400</w:t>
             </w:r>
           </w:p>
         </w:tc>
@@ -7023,7 +7023,7 @@
     <w:p/>
     <w:p>
       <w:r>
-        <w:t>Category-level analysis (Figure 6a) across all 11 clinical concept categories confirmed strong supervised encoder advantages across vaccines (VAX: 0.92 vs 0.77), treatments (TX: 0.89 vs 0.73), patient clinical status (STATUS: 0.83 vs 0.60), medical history (MHx: 0.83 vs 0.51), primary diagnoses (pDx: 0.66 vs 0.59), adverse-event symptoms (SYM: 0.77 vs 0.41), laboratory findings (Lab: 0.72 vs 0.47), and family history (FHx: 0.48 vs 0.45). Notably, few-shot LLaMA 4 successfully identified rare specialized categories unmodeled by the encoder, including cause of death (CoD: 0.50 F1; P = 0.67) and rule-out diagnoses (RO: 0.33 F1), while confirmed secondary diagnoses presented the steepest generalization gap (sDx: 0.77 vs 0.19). Error anatomy (Figure 6b) on the complete VAERS corpus (N = 1,000 reports) revealed that BioBERT achieved a high proportion of exact matches (56.0% vs 21.3%; 29,984 vs 12,026 spans) and low coverage errors (6.9% vs 13.7%; 3,679 vs 7,762 spans). Importantly, aligning the prompt to the official 11-category guideline substantially reduced LLaMA 4 hallucinations by 52.8% (spurious spans decreased from 33,421 down to 15,782; 27.9% vs 20.5% for BioBERT), while missed entities accounted for 37.0% (20,902 spans) versus 16.6% (8,875 spans) for BioBERT. Confusion breakdowns (Figure 6c &amp; 6d) demonstrated that the primary error mode for both models was distinguishing secondary diagnoses from adverse symptoms (sDx → SYM: 2,174 for BioBERT; 8,295 for LLaMA 4), alongside reciprocal symptom-to-diagnosis shifts (SYM → sDx: 921 for BioBERT; 1,320 for LLaMA 4) and symptom conflation with medical history (SYM → MHx: 908 for LLaMA 4) and lab findings (SYM → Lab: 647 for BioBERT; 906 for LLaMA 4).</w:t>
+        <w:t>Category-level analysis (Figure 6a) across all 11 clinical concept categories confirmed strong supervised encoder advantages across vaccines (VAX: 0.93 vs 0.85), treatments (TX: 0.92 vs 0.76), secondary diagnoses (sDx: 0.87 vs 0.62), medical history (MHx: 0.85 vs 0.58), patient clinical status (STATUS: 0.83 vs 0.61), primary diagnoses (pDx: 0.83 vs 0.70), adverse-event symptoms (SYM: 0.78 vs 0.57), laboratory findings (Lab: 0.76 vs 0.56), and family history (FHx: 0.65 vs 0.51). Notably, few-shot LLaMA 4 successfully extracted specialized categories unmodeled by the encoder, including cause of death (CoD: 0.70 F1; P = 0.67, R = 0.73) and rule-out diagnoses (RO: 0.53 F1), while overall micro-average performance reached 0.84 for BioBERT versus 0.64 for LLaMA 4. Error anatomy (Figure 6b) on the complete VAERS corpus (N = 1,000 reports) evaluated under 1-to-1 best-overlap matching revealed that BioBERT achieved 64.5% exact matches (15,068 spans) and 19.3% coverage errors (4,506 spans), with only 8.9% spurious spans (2,081) and 7.3% misses (1,711). In contrast, LLaMA 4 produced 30.4% exact matches (12,015 spans) and 49.3% coverage errors (19,476 spans), while spurious hallucinations (10.3%; 4,079 spans) and true unpredicted omissions (10.0%; 3,972 spans) remained balanced. Confusion breakdowns (Figure 6c &amp; 6d) demonstrated that the predominant error mode for LLaMA 4 was subsuming secondary diagnoses under adverse symptoms (sDx → SYM: 4,452), accompanied by reciprocal symptom-to-diagnosis misclassifications (SYM → sDx: 1,093), symptom conflation with medical history (SYM → MHx: 758), and symptom labeling of laboratory results (SYM → Lab: 745). For BioBERT, confusions similarly peaked at sDx → SYM (782) and SYM → sDx (350), but at markedly lower absolute frequencies.</w:t>
       </w:r>
     </w:p>
     <w:p/>
@@ -7091,7 +7091,7 @@
         </w:rPr>
       </w:pPr>
       <w:r>
-        <w:t>Figure 6. Cross-Domain Annotation Benchmark and Error Anatomy on the Full VAERS Vaccine Safety Corpus Across 11 Concept Categories (N = 1,000 Reports). (a) Per-category performance across all 11 clinical concept categories and overall micro-average for BioBERT (Blue) vs. LLaMA 4 (Pink-Coral), showing F1 bars and precision/recall trajectories. (b) M/C/S/N error distribution for BioBERT vs. LLaMA 4 across the complete corpus. (c) BioBERT top label misclassifications (X-axis: 0–9,500). (d) LLaMA 4 top label misclassifications (X-axis: 0–9,500, aligned with panel c).</w:t>
+        <w:t>Figure 6. Cross-Domain Annotation Benchmark and Error Anatomy on the Full VAERS Vaccine Safety Corpus Across 11 Concept Categories (N = 1,000 Reports). (a) Per-category performance across all 11 clinical concept categories and overall micro-average for BioBERT (Blue) vs. LLaMA 4 (Pink-Coral), showing F1 bars and precision/recall trajectories. (b) M/C/S/N error distribution for BioBERT vs. LLaMA 4 evaluated using 1-to-1 best-overlap matching (M: exact match; C: coverage and conflation error; S: spurious prediction; N: miss). (c) BioBERT top label misclassifications (X-axis: 0–5,200). (d) LLaMA 4 top label misclassifications (X-axis: 0–5,200, aligned with panel c).</w:t>
       </w:r>
     </w:p>
     <w:p/>
@@ -7870,7 +7870,7 @@
     </w:p>
     <w:p>
       <w:r>
-        <w:t>To rigorously verify neural network optimization stability, we conducted 5 independent training runs using random initialization seeds (42, 123, 456, 789, 1011) across both FAERS 4-fold LOO (20 total model runs, 17 categories) and VAERS 10-fold CV (50 total model runs). As summarized in Table 6, cross-seed variance was exceptionally low across both datasets. On FAERS, strict F1 averaged 0.5685 ± 0.0080 (0.7463 ± 0.0076 Adapted F1) across the 5 seeds. On VAERS, strict F1 averaged 0.6595 ± 0.0015 (0.7882 ± 0.0022 Adapted F1) across the 5 seeds. These findings confirm that supervised BioBERT convergence is remarkably robust to stochastic weight initialization, with between-series clinical diversity accounting for substantially greater performance variance than random initialization.</w:t>
+        <w:t>To rigorously verify neural network optimization stability, we conducted 5 independent training runs using random initialization seeds (42, 123, 456, 789, 1011) across both FAERS 4-fold LOO (20 total model runs, 17 categories) and VAERS 10-fold CV (50 total model runs). As summarized in Table 6, cross-seed variance was exceptionally low across both datasets. On FAERS, strict F1 averaged 0.5685 ± 0.0080 (0.7463 ± 0.0076 Adapted F1) across the 5 seeds. On VAERS, strict F1 averaged 0.7009 ± 0.0016 (0.8397 ± 0.0018 Adapted F1) across the 5 seeds. These findings confirm that supervised BioBERT convergence is remarkably robust to stochastic weight initialization, with between-series clinical diversity accounting for substantially greater performance variance than random initialization.</w:t>
       </w:r>
     </w:p>
     <w:p>
@@ -8808,7 +8808,7 @@
                 <w:color w:val="222222"/>
                 <w:sz w:val="16"/>
               </w:rPr>
-              <w:t>0.6594 ± 0.0196</w:t>
+              <w:t>0.7015 ± 0.0174</w:t>
             </w:r>
           </w:p>
         </w:tc>
@@ -8837,7 +8837,7 @@
                 <w:color w:val="222222"/>
                 <w:sz w:val="16"/>
               </w:rPr>
-              <w:t>0.7848 ± 0.0127</w:t>
+              <w:t>0.8370 ± 0.0095</w:t>
             </w:r>
           </w:p>
         </w:tc>
@@ -8926,7 +8926,7 @@
                 <w:color w:val="222222"/>
                 <w:sz w:val="16"/>
               </w:rPr>
-              <w:t>0.6601 ± 0.0175</w:t>
+              <w:t>0.7013 ± 0.0156</w:t>
             </w:r>
           </w:p>
         </w:tc>
@@ -8955,7 +8955,7 @@
                 <w:color w:val="222222"/>
                 <w:sz w:val="16"/>
               </w:rPr>
-              <w:t>0.7891 ± 0.0104</w:t>
+              <w:t>0.8405 ± 0.0070</w:t>
             </w:r>
           </w:p>
         </w:tc>
@@ -9044,7 +9044,7 @@
                 <w:color w:val="222222"/>
                 <w:sz w:val="16"/>
               </w:rPr>
-              <w:t>0.6593 ± 0.0218</w:t>
+              <w:t>0.7008 ± 0.0202</w:t>
             </w:r>
           </w:p>
         </w:tc>
@@ -9073,7 +9073,7 @@
                 <w:color w:val="222222"/>
                 <w:sz w:val="16"/>
               </w:rPr>
-              <w:t>0.7883 ± 0.0138</w:t>
+              <w:t>0.8400 ± 0.0113</w:t>
             </w:r>
           </w:p>
         </w:tc>
@@ -9162,7 +9162,7 @@
                 <w:color w:val="222222"/>
                 <w:sz w:val="16"/>
               </w:rPr>
-              <w:t>0.6615 ± 0.0159</w:t>
+              <w:t>0.7026 ± 0.0152</w:t>
             </w:r>
           </w:p>
         </w:tc>
@@ -9191,7 +9191,7 @@
                 <w:color w:val="222222"/>
                 <w:sz w:val="16"/>
               </w:rPr>
-              <w:t>0.7907 ± 0.0095</w:t>
+              <w:t>0.8419 ± 0.0082</w:t>
             </w:r>
           </w:p>
         </w:tc>
@@ -9280,7 +9280,7 @@
                 <w:color w:val="222222"/>
                 <w:sz w:val="16"/>
               </w:rPr>
-              <w:t>0.6574 ± 0.0169</w:t>
+              <w:t>0.6983 ± 0.0159</w:t>
             </w:r>
           </w:p>
         </w:tc>
@@ -9309,7 +9309,7 @@
                 <w:color w:val="222222"/>
                 <w:sz w:val="16"/>
               </w:rPr>
-              <w:t>0.7879 ± 0.0106</w:t>
+              <w:t>0.8389 ± 0.0091</w:t>
             </w:r>
           </w:p>
         </w:tc>
@@ -9398,7 +9398,7 @@
                 <w:color w:val="222222"/>
                 <w:sz w:val="16"/>
               </w:rPr>
-              <w:t>0.6595 ± 0.0015</w:t>
+              <w:t>0.7009 ± 0.0016</w:t>
             </w:r>
           </w:p>
         </w:tc>
@@ -9427,7 +9427,7 @@
                 <w:color w:val="222222"/>
                 <w:sz w:val="16"/>
               </w:rPr>
-              <w:t>0.7882 ± 0.0022</w:t>
+              <w:t>0.8397 ± 0.0018</w:t>
             </w:r>
           </w:p>
         </w:tc>

</xml_diff>